<commit_message>
Proforma ATINKOU : perimetre fournitures reduit et suppression de la TVA
Devis A (fournitures) :
- Retrait du kit joints / relais pilote du positionneur YTC YT-200,
  celui-ci ayant deja ete livre (- 95 000)
- Ligne SITRANS P320 : retrait des joints de raccord process du libelle,
  prix unitaire inchange (45 000)
- Nouveau total : 610 000 FCFA

Devis A et B : TVA non applicable. Les libelles HT / TTC sont remplaces
par des intitules neutres (TOTAL A PAYER, Montant, Prix) et la mention
de regime fiscal est a preciser dans les conditions.

Devis B inchange sur le fond : 1 980 000 moins 5 % = 1 881 000 FCFA.
Total du programme : 2 491 000 FCFA.

Co-Authored-By: Claude Opus 5 <noreply@anthropic.com>
Claude-Session: https://claude.ai/code/session_012D3xncAniQbmajvLrDnCcc
</commit_message>
<xml_diff>
--- a/docs/proformas/atinkou/Proforma_ATINKOU_014A_Fournitures.docx
+++ b/docs/proformas/atinkou/Proforma_ATINKOU_014A_Fournitures.docx
@@ -507,7 +507,7 @@
                 <w:sz w:val="18"/>
                 <w:szCs w:val="18"/>
               </w:rPr>
-              <w:t xml:space="preserve">P.U. HT</w:t>
+              <w:t xml:space="preserve">P.U.</w:t>
             </w:r>
           </w:p>
         </w:tc>
@@ -539,7 +539,7 @@
                 <w:sz w:val="18"/>
                 <w:szCs w:val="18"/>
               </w:rPr>
-              <w:t xml:space="preserve">Montant HT</w:t>
+              <w:t xml:space="preserve">Montant</w:t>
             </w:r>
           </w:p>
         </w:tc>
@@ -1005,7 +1005,7 @@
                 <w:sz w:val="18"/>
                 <w:szCs w:val="18"/>
               </w:rPr>
-              <w:t xml:space="preserve">Kit de joints et relais pilote — positionneur ROTORK YTC YT-200</w:t>
+              <w:t xml:space="preserve">Condensateurs et composants de commutation — alimentation PULS CP10.481</w:t>
             </w:r>
           </w:p>
           <w:p>
@@ -1024,164 +1024,7 @@
                 <w:sz w:val="16"/>
                 <w:szCs w:val="16"/>
               </w:rPr>
-              <w:t xml:space="preserve">Kit d’étanchéité complet du bloc pneumatique et relais pilote de rechange.</w:t>
-            </w:r>
-          </w:p>
-        </w:tc>
-        <w:tc>
-          <w:tcPr>
-            <w:tcW w:type="dxa" w:w="700"/>
-            <w:tcMar>
-              <w:top w:type="dxa" w:w="60"/>
-              <w:left w:type="dxa" w:w="100"/>
-              <w:bottom w:type="dxa" w:w="60"/>
-              <w:right w:type="dxa" w:w="100"/>
-            </w:tcMar>
-            <w:vAlign w:val="center"/>
-          </w:tcPr>
-          <w:p>
-            <w:pPr>
-              <w:spacing w:after="0"/>
-              <w:jc w:val="center"/>
-            </w:pPr>
-            <w:r>
-              <w:rPr>
-                <w:rFonts w:ascii="Calibri" w:cs="Calibri" w:eastAsia="Calibri" w:hAnsi="Calibri"/>
-                <w:b w:val="false"/>
-                <w:bCs w:val="false"/>
-                <w:i w:val="false"/>
-                <w:iCs w:val="false"/>
-                <w:color w:val="000000"/>
-                <w:sz w:val="18"/>
-                <w:szCs w:val="18"/>
-              </w:rPr>
-              <w:t xml:space="preserve">1</w:t>
-            </w:r>
-          </w:p>
-        </w:tc>
-        <w:tc>
-          <w:tcPr>
-            <w:tcW w:type="dxa" w:w="1600"/>
-            <w:tcMar>
-              <w:top w:type="dxa" w:w="60"/>
-              <w:left w:type="dxa" w:w="100"/>
-              <w:bottom w:type="dxa" w:w="60"/>
-              <w:right w:type="dxa" w:w="100"/>
-            </w:tcMar>
-            <w:vAlign w:val="center"/>
-          </w:tcPr>
-          <w:p>
-            <w:pPr>
-              <w:spacing w:after="0"/>
-              <w:jc w:val="right"/>
-            </w:pPr>
-            <w:r>
-              <w:rPr>
-                <w:rFonts w:ascii="Calibri" w:cs="Calibri" w:eastAsia="Calibri" w:hAnsi="Calibri"/>
-                <w:b w:val="false"/>
-                <w:bCs w:val="false"/>
-                <w:i w:val="false"/>
-                <w:iCs w:val="false"/>
-                <w:color w:val="000000"/>
-                <w:sz w:val="18"/>
-                <w:szCs w:val="18"/>
-              </w:rPr>
-              <w:t xml:space="preserve">95 000</w:t>
-            </w:r>
-          </w:p>
-        </w:tc>
-        <w:tc>
-          <w:tcPr>
-            <w:tcW w:type="dxa" w:w="1800"/>
-            <w:tcMar>
-              <w:top w:type="dxa" w:w="60"/>
-              <w:left w:type="dxa" w:w="100"/>
-              <w:bottom w:type="dxa" w:w="60"/>
-              <w:right w:type="dxa" w:w="100"/>
-            </w:tcMar>
-            <w:vAlign w:val="center"/>
-          </w:tcPr>
-          <w:p>
-            <w:pPr>
-              <w:spacing w:after="0"/>
-              <w:jc w:val="right"/>
-            </w:pPr>
-            <w:r>
-              <w:rPr>
-                <w:rFonts w:ascii="Calibri" w:cs="Calibri" w:eastAsia="Calibri" w:hAnsi="Calibri"/>
-                <w:b/>
-                <w:bCs/>
-                <w:i w:val="false"/>
-                <w:iCs w:val="false"/>
-                <w:color w:val="000000"/>
-                <w:sz w:val="18"/>
-                <w:szCs w:val="18"/>
-              </w:rPr>
-              <w:t xml:space="preserve">95 000</w:t>
-            </w:r>
-          </w:p>
-        </w:tc>
-      </w:tr>
-      <w:tr>
-        <w:tc>
-          <w:tcPr>
-            <w:tcW w:type="dxa" w:w="600"/>
-            <w:tcMar>
-              <w:top w:type="dxa" w:w="60"/>
-              <w:left w:type="dxa" w:w="100"/>
-              <w:bottom w:type="dxa" w:w="60"/>
-              <w:right w:type="dxa" w:w="100"/>
-            </w:tcMar>
-            <w:vAlign w:val="center"/>
-          </w:tcPr>
-          <w:p>
-            <w:pPr>
-              <w:spacing w:after="0"/>
-              <w:jc w:val="center"/>
-            </w:pPr>
-            <w:r>
-              <w:rPr>
-                <w:rFonts w:ascii="Calibri" w:cs="Calibri" w:eastAsia="Calibri" w:hAnsi="Calibri"/>
-                <w:b w:val="false"/>
-                <w:bCs w:val="false"/>
-                <w:i w:val="false"/>
-                <w:iCs w:val="false"/>
-                <w:color w:val="000000"/>
-                <w:sz w:val="18"/>
-                <w:szCs w:val="18"/>
-              </w:rPr>
-              <w:t xml:space="preserve">4</w:t>
-            </w:r>
-          </w:p>
-        </w:tc>
-        <w:tc>
-          <w:tcPr>
-            <w:tcW w:type="dxa" w:w="5200"/>
-            <w:tcMar>
-              <w:top w:type="dxa" w:w="60"/>
-              <w:left w:type="dxa" w:w="100"/>
-              <w:bottom w:type="dxa" w:w="60"/>
-              <w:right w:type="dxa" w:w="100"/>
-            </w:tcMar>
-            <w:vAlign w:val="center"/>
-          </w:tcPr>
-          <w:p>
-            <w:pPr>
-              <w:spacing w:after="0"/>
-              <w:jc w:val="left"/>
-            </w:pPr>
-            <w:r>
-              <w:rPr>
-                <w:rFonts w:ascii="Calibri" w:cs="Calibri" w:eastAsia="Calibri" w:hAnsi="Calibri"/>
-                <w:b/>
-                <w:bCs/>
-                <w:i w:val="false"/>
-                <w:iCs w:val="false"/>
-                <w:color w:val="000000"/>
-                <w:sz w:val="18"/>
-                <w:szCs w:val="18"/>
-              </w:rPr>
-              <w:t xml:space="preserve">Condensateurs et composants de commutation — alimentation PULS CP10.481</w:t>
+              <w:t xml:space="preserve">Condensateurs électrolytiques basse ESR, transistor de commutation,</w:t>
             </w:r>
           </w:p>
           <w:p>
@@ -1200,7 +1043,164 @@
                 <w:sz w:val="16"/>
                 <w:szCs w:val="16"/>
               </w:rPr>
-              <w:t xml:space="preserve">Condensateurs électrolytiques basse ESR, transistor de commutation,</w:t>
+              <w:t xml:space="preserve">composants de l’étage primaire 100-240 V AC.</w:t>
+            </w:r>
+          </w:p>
+        </w:tc>
+        <w:tc>
+          <w:tcPr>
+            <w:tcW w:type="dxa" w:w="700"/>
+            <w:tcMar>
+              <w:top w:type="dxa" w:w="60"/>
+              <w:left w:type="dxa" w:w="100"/>
+              <w:bottom w:type="dxa" w:w="60"/>
+              <w:right w:type="dxa" w:w="100"/>
+            </w:tcMar>
+            <w:vAlign w:val="center"/>
+          </w:tcPr>
+          <w:p>
+            <w:pPr>
+              <w:spacing w:after="0"/>
+              <w:jc w:val="center"/>
+            </w:pPr>
+            <w:r>
+              <w:rPr>
+                <w:rFonts w:ascii="Calibri" w:cs="Calibri" w:eastAsia="Calibri" w:hAnsi="Calibri"/>
+                <w:b w:val="false"/>
+                <w:bCs w:val="false"/>
+                <w:i w:val="false"/>
+                <w:iCs w:val="false"/>
+                <w:color w:val="000000"/>
+                <w:sz w:val="18"/>
+                <w:szCs w:val="18"/>
+              </w:rPr>
+              <w:t xml:space="preserve">1</w:t>
+            </w:r>
+          </w:p>
+        </w:tc>
+        <w:tc>
+          <w:tcPr>
+            <w:tcW w:type="dxa" w:w="1600"/>
+            <w:tcMar>
+              <w:top w:type="dxa" w:w="60"/>
+              <w:left w:type="dxa" w:w="100"/>
+              <w:bottom w:type="dxa" w:w="60"/>
+              <w:right w:type="dxa" w:w="100"/>
+            </w:tcMar>
+            <w:vAlign w:val="center"/>
+          </w:tcPr>
+          <w:p>
+            <w:pPr>
+              <w:spacing w:after="0"/>
+              <w:jc w:val="right"/>
+            </w:pPr>
+            <w:r>
+              <w:rPr>
+                <w:rFonts w:ascii="Calibri" w:cs="Calibri" w:eastAsia="Calibri" w:hAnsi="Calibri"/>
+                <w:b w:val="false"/>
+                <w:bCs w:val="false"/>
+                <w:i w:val="false"/>
+                <w:iCs w:val="false"/>
+                <w:color w:val="000000"/>
+                <w:sz w:val="18"/>
+                <w:szCs w:val="18"/>
+              </w:rPr>
+              <w:t xml:space="preserve">65 000</w:t>
+            </w:r>
+          </w:p>
+        </w:tc>
+        <w:tc>
+          <w:tcPr>
+            <w:tcW w:type="dxa" w:w="1800"/>
+            <w:tcMar>
+              <w:top w:type="dxa" w:w="60"/>
+              <w:left w:type="dxa" w:w="100"/>
+              <w:bottom w:type="dxa" w:w="60"/>
+              <w:right w:type="dxa" w:w="100"/>
+            </w:tcMar>
+            <w:vAlign w:val="center"/>
+          </w:tcPr>
+          <w:p>
+            <w:pPr>
+              <w:spacing w:after="0"/>
+              <w:jc w:val="right"/>
+            </w:pPr>
+            <w:r>
+              <w:rPr>
+                <w:rFonts w:ascii="Calibri" w:cs="Calibri" w:eastAsia="Calibri" w:hAnsi="Calibri"/>
+                <w:b/>
+                <w:bCs/>
+                <w:i w:val="false"/>
+                <w:iCs w:val="false"/>
+                <w:color w:val="000000"/>
+                <w:sz w:val="18"/>
+                <w:szCs w:val="18"/>
+              </w:rPr>
+              <w:t xml:space="preserve">65 000</w:t>
+            </w:r>
+          </w:p>
+        </w:tc>
+      </w:tr>
+      <w:tr>
+        <w:tc>
+          <w:tcPr>
+            <w:tcW w:type="dxa" w:w="600"/>
+            <w:tcMar>
+              <w:top w:type="dxa" w:w="60"/>
+              <w:left w:type="dxa" w:w="100"/>
+              <w:bottom w:type="dxa" w:w="60"/>
+              <w:right w:type="dxa" w:w="100"/>
+            </w:tcMar>
+            <w:vAlign w:val="center"/>
+          </w:tcPr>
+          <w:p>
+            <w:pPr>
+              <w:spacing w:after="0"/>
+              <w:jc w:val="center"/>
+            </w:pPr>
+            <w:r>
+              <w:rPr>
+                <w:rFonts w:ascii="Calibri" w:cs="Calibri" w:eastAsia="Calibri" w:hAnsi="Calibri"/>
+                <w:b w:val="false"/>
+                <w:bCs w:val="false"/>
+                <w:i w:val="false"/>
+                <w:iCs w:val="false"/>
+                <w:color w:val="000000"/>
+                <w:sz w:val="18"/>
+                <w:szCs w:val="18"/>
+              </w:rPr>
+              <w:t xml:space="preserve">4</w:t>
+            </w:r>
+          </w:p>
+        </w:tc>
+        <w:tc>
+          <w:tcPr>
+            <w:tcW w:type="dxa" w:w="5200"/>
+            <w:tcMar>
+              <w:top w:type="dxa" w:w="60"/>
+              <w:left w:type="dxa" w:w="100"/>
+              <w:bottom w:type="dxa" w:w="60"/>
+              <w:right w:type="dxa" w:w="100"/>
+            </w:tcMar>
+            <w:vAlign w:val="center"/>
+          </w:tcPr>
+          <w:p>
+            <w:pPr>
+              <w:spacing w:after="0"/>
+              <w:jc w:val="left"/>
+            </w:pPr>
+            <w:r>
+              <w:rPr>
+                <w:rFonts w:ascii="Calibri" w:cs="Calibri" w:eastAsia="Calibri" w:hAnsi="Calibri"/>
+                <w:b/>
+                <w:bCs/>
+                <w:i w:val="false"/>
+                <w:iCs w:val="false"/>
+                <w:color w:val="000000"/>
+                <w:sz w:val="18"/>
+                <w:szCs w:val="18"/>
+              </w:rPr>
+              <w:t xml:space="preserve">Connectique et pièces de reprise — transmetteurs SITRANS P320</w:t>
             </w:r>
           </w:p>
           <w:p>
@@ -1219,164 +1219,7 @@
                 <w:sz w:val="16"/>
                 <w:szCs w:val="16"/>
               </w:rPr>
-              <w:t xml:space="preserve">composants de l’étage primaire 100-240 V AC.</w:t>
-            </w:r>
-          </w:p>
-        </w:tc>
-        <w:tc>
-          <w:tcPr>
-            <w:tcW w:type="dxa" w:w="700"/>
-            <w:tcMar>
-              <w:top w:type="dxa" w:w="60"/>
-              <w:left w:type="dxa" w:w="100"/>
-              <w:bottom w:type="dxa" w:w="60"/>
-              <w:right w:type="dxa" w:w="100"/>
-            </w:tcMar>
-            <w:vAlign w:val="center"/>
-          </w:tcPr>
-          <w:p>
-            <w:pPr>
-              <w:spacing w:after="0"/>
-              <w:jc w:val="center"/>
-            </w:pPr>
-            <w:r>
-              <w:rPr>
-                <w:rFonts w:ascii="Calibri" w:cs="Calibri" w:eastAsia="Calibri" w:hAnsi="Calibri"/>
-                <w:b w:val="false"/>
-                <w:bCs w:val="false"/>
-                <w:i w:val="false"/>
-                <w:iCs w:val="false"/>
-                <w:color w:val="000000"/>
-                <w:sz w:val="18"/>
-                <w:szCs w:val="18"/>
-              </w:rPr>
-              <w:t xml:space="preserve">1</w:t>
-            </w:r>
-          </w:p>
-        </w:tc>
-        <w:tc>
-          <w:tcPr>
-            <w:tcW w:type="dxa" w:w="1600"/>
-            <w:tcMar>
-              <w:top w:type="dxa" w:w="60"/>
-              <w:left w:type="dxa" w:w="100"/>
-              <w:bottom w:type="dxa" w:w="60"/>
-              <w:right w:type="dxa" w:w="100"/>
-            </w:tcMar>
-            <w:vAlign w:val="center"/>
-          </w:tcPr>
-          <w:p>
-            <w:pPr>
-              <w:spacing w:after="0"/>
-              <w:jc w:val="right"/>
-            </w:pPr>
-            <w:r>
-              <w:rPr>
-                <w:rFonts w:ascii="Calibri" w:cs="Calibri" w:eastAsia="Calibri" w:hAnsi="Calibri"/>
-                <w:b w:val="false"/>
-                <w:bCs w:val="false"/>
-                <w:i w:val="false"/>
-                <w:iCs w:val="false"/>
-                <w:color w:val="000000"/>
-                <w:sz w:val="18"/>
-                <w:szCs w:val="18"/>
-              </w:rPr>
-              <w:t xml:space="preserve">65 000</w:t>
-            </w:r>
-          </w:p>
-        </w:tc>
-        <w:tc>
-          <w:tcPr>
-            <w:tcW w:type="dxa" w:w="1800"/>
-            <w:tcMar>
-              <w:top w:type="dxa" w:w="60"/>
-              <w:left w:type="dxa" w:w="100"/>
-              <w:bottom w:type="dxa" w:w="60"/>
-              <w:right w:type="dxa" w:w="100"/>
-            </w:tcMar>
-            <w:vAlign w:val="center"/>
-          </w:tcPr>
-          <w:p>
-            <w:pPr>
-              <w:spacing w:after="0"/>
-              <w:jc w:val="right"/>
-            </w:pPr>
-            <w:r>
-              <w:rPr>
-                <w:rFonts w:ascii="Calibri" w:cs="Calibri" w:eastAsia="Calibri" w:hAnsi="Calibri"/>
-                <w:b/>
-                <w:bCs/>
-                <w:i w:val="false"/>
-                <w:iCs w:val="false"/>
-                <w:color w:val="000000"/>
-                <w:sz w:val="18"/>
-                <w:szCs w:val="18"/>
-              </w:rPr>
-              <w:t xml:space="preserve">65 000</w:t>
-            </w:r>
-          </w:p>
-        </w:tc>
-      </w:tr>
-      <w:tr>
-        <w:tc>
-          <w:tcPr>
-            <w:tcW w:type="dxa" w:w="600"/>
-            <w:tcMar>
-              <w:top w:type="dxa" w:w="60"/>
-              <w:left w:type="dxa" w:w="100"/>
-              <w:bottom w:type="dxa" w:w="60"/>
-              <w:right w:type="dxa" w:w="100"/>
-            </w:tcMar>
-            <w:vAlign w:val="center"/>
-          </w:tcPr>
-          <w:p>
-            <w:pPr>
-              <w:spacing w:after="0"/>
-              <w:jc w:val="center"/>
-            </w:pPr>
-            <w:r>
-              <w:rPr>
-                <w:rFonts w:ascii="Calibri" w:cs="Calibri" w:eastAsia="Calibri" w:hAnsi="Calibri"/>
-                <w:b w:val="false"/>
-                <w:bCs w:val="false"/>
-                <w:i w:val="false"/>
-                <w:iCs w:val="false"/>
-                <w:color w:val="000000"/>
-                <w:sz w:val="18"/>
-                <w:szCs w:val="18"/>
-              </w:rPr>
-              <w:t xml:space="preserve">5</w:t>
-            </w:r>
-          </w:p>
-        </w:tc>
-        <w:tc>
-          <w:tcPr>
-            <w:tcW w:type="dxa" w:w="5200"/>
-            <w:tcMar>
-              <w:top w:type="dxa" w:w="60"/>
-              <w:left w:type="dxa" w:w="100"/>
-              <w:bottom w:type="dxa" w:w="60"/>
-              <w:right w:type="dxa" w:w="100"/>
-            </w:tcMar>
-            <w:vAlign w:val="center"/>
-          </w:tcPr>
-          <w:p>
-            <w:pPr>
-              <w:spacing w:after="0"/>
-              <w:jc w:val="left"/>
-            </w:pPr>
-            <w:r>
-              <w:rPr>
-                <w:rFonts w:ascii="Calibri" w:cs="Calibri" w:eastAsia="Calibri" w:hAnsi="Calibri"/>
-                <w:b/>
-                <w:bCs/>
-                <w:i w:val="false"/>
-                <w:iCs w:val="false"/>
-                <w:color w:val="000000"/>
-                <w:sz w:val="18"/>
-                <w:szCs w:val="18"/>
-              </w:rPr>
-              <w:t xml:space="preserve">Connectique, joints et pièces de reprise — transmetteurs SITRANS P320</w:t>
+              <w:t xml:space="preserve">Réf. 7MF03D0-1VE01-5AF2-Z · presse-étoupes, bornier de raccordement</w:t>
             </w:r>
           </w:p>
           <w:p>
@@ -1395,7 +1238,7 @@
                 <w:sz w:val="16"/>
                 <w:szCs w:val="16"/>
               </w:rPr>
-              <w:t xml:space="preserve">Réf. 7MF03D0-1VE01-5AF2-Z · joints de raccord process, presse-étoupes,</w:t>
+              <w:t xml:space="preserve">et composants de la carte électronique.</w:t>
             </w:r>
           </w:p>
           <w:p>
@@ -1414,7 +1257,195 @@
                 <w:sz w:val="16"/>
                 <w:szCs w:val="16"/>
               </w:rPr>
-              <w:t xml:space="preserve">bornier de raccordement et composants de la carte électronique.</w:t>
+              <w:t xml:space="preserve">Quantité pour trois transmetteurs.</w:t>
+            </w:r>
+          </w:p>
+        </w:tc>
+        <w:tc>
+          <w:tcPr>
+            <w:tcW w:type="dxa" w:w="700"/>
+            <w:tcMar>
+              <w:top w:type="dxa" w:w="60"/>
+              <w:left w:type="dxa" w:w="100"/>
+              <w:bottom w:type="dxa" w:w="60"/>
+              <w:right w:type="dxa" w:w="100"/>
+            </w:tcMar>
+            <w:vAlign w:val="center"/>
+          </w:tcPr>
+          <w:p>
+            <w:pPr>
+              <w:spacing w:after="0"/>
+              <w:jc w:val="center"/>
+            </w:pPr>
+            <w:r>
+              <w:rPr>
+                <w:rFonts w:ascii="Calibri" w:cs="Calibri" w:eastAsia="Calibri" w:hAnsi="Calibri"/>
+                <w:b w:val="false"/>
+                <w:bCs w:val="false"/>
+                <w:i w:val="false"/>
+                <w:iCs w:val="false"/>
+                <w:color w:val="000000"/>
+                <w:sz w:val="18"/>
+                <w:szCs w:val="18"/>
+              </w:rPr>
+              <w:t xml:space="preserve">3</w:t>
+            </w:r>
+          </w:p>
+        </w:tc>
+        <w:tc>
+          <w:tcPr>
+            <w:tcW w:type="dxa" w:w="1600"/>
+            <w:tcMar>
+              <w:top w:type="dxa" w:w="60"/>
+              <w:left w:type="dxa" w:w="100"/>
+              <w:bottom w:type="dxa" w:w="60"/>
+              <w:right w:type="dxa" w:w="100"/>
+            </w:tcMar>
+            <w:vAlign w:val="center"/>
+          </w:tcPr>
+          <w:p>
+            <w:pPr>
+              <w:spacing w:after="0"/>
+              <w:jc w:val="right"/>
+            </w:pPr>
+            <w:r>
+              <w:rPr>
+                <w:rFonts w:ascii="Calibri" w:cs="Calibri" w:eastAsia="Calibri" w:hAnsi="Calibri"/>
+                <w:b w:val="false"/>
+                <w:bCs w:val="false"/>
+                <w:i w:val="false"/>
+                <w:iCs w:val="false"/>
+                <w:color w:val="000000"/>
+                <w:sz w:val="18"/>
+                <w:szCs w:val="18"/>
+              </w:rPr>
+              <w:t xml:space="preserve">45 000</w:t>
+            </w:r>
+          </w:p>
+        </w:tc>
+        <w:tc>
+          <w:tcPr>
+            <w:tcW w:type="dxa" w:w="1800"/>
+            <w:tcMar>
+              <w:top w:type="dxa" w:w="60"/>
+              <w:left w:type="dxa" w:w="100"/>
+              <w:bottom w:type="dxa" w:w="60"/>
+              <w:right w:type="dxa" w:w="100"/>
+            </w:tcMar>
+            <w:vAlign w:val="center"/>
+          </w:tcPr>
+          <w:p>
+            <w:pPr>
+              <w:spacing w:after="0"/>
+              <w:jc w:val="right"/>
+            </w:pPr>
+            <w:r>
+              <w:rPr>
+                <w:rFonts w:ascii="Calibri" w:cs="Calibri" w:eastAsia="Calibri" w:hAnsi="Calibri"/>
+                <w:b/>
+                <w:bCs/>
+                <w:i w:val="false"/>
+                <w:iCs w:val="false"/>
+                <w:color w:val="000000"/>
+                <w:sz w:val="18"/>
+                <w:szCs w:val="18"/>
+              </w:rPr>
+              <w:t xml:space="preserve">135 000</w:t>
+            </w:r>
+          </w:p>
+        </w:tc>
+      </w:tr>
+      <w:tr>
+        <w:tc>
+          <w:tcPr>
+            <w:tcW w:type="dxa" w:w="9900"/>
+            <w:gridSpan w:val="5"/>
+            <w:shd w:fill="F2F2F2" w:color="auto" w:val="clear"/>
+            <w:tcMar>
+              <w:top w:type="dxa" w:w="60"/>
+              <w:left w:type="dxa" w:w="100"/>
+              <w:bottom w:type="dxa" w:w="60"/>
+              <w:right w:type="dxa" w:w="100"/>
+            </w:tcMar>
+          </w:tcPr>
+          <w:p>
+            <w:pPr>
+              <w:spacing w:after="0"/>
+            </w:pPr>
+            <w:r>
+              <w:rPr>
+                <w:rFonts w:ascii="Calibri" w:cs="Calibri" w:eastAsia="Calibri" w:hAnsi="Calibri"/>
+                <w:b/>
+                <w:bCs/>
+                <w:color w:val="1F3864"/>
+                <w:sz w:val="18"/>
+                <w:szCs w:val="18"/>
+              </w:rPr>
+              <w:t xml:space="preserve">B — CONSOMMABLES ET APPROVISIONNEMENT</w:t>
+            </w:r>
+          </w:p>
+        </w:tc>
+      </w:tr>
+      <w:tr>
+        <w:tc>
+          <w:tcPr>
+            <w:tcW w:type="dxa" w:w="600"/>
+            <w:tcMar>
+              <w:top w:type="dxa" w:w="60"/>
+              <w:left w:type="dxa" w:w="100"/>
+              <w:bottom w:type="dxa" w:w="60"/>
+              <w:right w:type="dxa" w:w="100"/>
+            </w:tcMar>
+            <w:vAlign w:val="center"/>
+          </w:tcPr>
+          <w:p>
+            <w:pPr>
+              <w:spacing w:after="0"/>
+              <w:jc w:val="center"/>
+            </w:pPr>
+            <w:r>
+              <w:rPr>
+                <w:rFonts w:ascii="Calibri" w:cs="Calibri" w:eastAsia="Calibri" w:hAnsi="Calibri"/>
+                <w:b w:val="false"/>
+                <w:bCs w:val="false"/>
+                <w:i w:val="false"/>
+                <w:iCs w:val="false"/>
+                <w:color w:val="000000"/>
+                <w:sz w:val="18"/>
+                <w:szCs w:val="18"/>
+              </w:rPr>
+              <w:t xml:space="preserve">5</w:t>
+            </w:r>
+          </w:p>
+        </w:tc>
+        <w:tc>
+          <w:tcPr>
+            <w:tcW w:type="dxa" w:w="5200"/>
+            <w:tcMar>
+              <w:top w:type="dxa" w:w="60"/>
+              <w:left w:type="dxa" w:w="100"/>
+              <w:bottom w:type="dxa" w:w="60"/>
+              <w:right w:type="dxa" w:w="100"/>
+            </w:tcMar>
+            <w:vAlign w:val="center"/>
+          </w:tcPr>
+          <w:p>
+            <w:pPr>
+              <w:spacing w:after="0"/>
+              <w:jc w:val="left"/>
+            </w:pPr>
+            <w:r>
+              <w:rPr>
+                <w:rFonts w:ascii="Calibri" w:cs="Calibri" w:eastAsia="Calibri" w:hAnsi="Calibri"/>
+                <w:b/>
+                <w:bCs/>
+                <w:i w:val="false"/>
+                <w:iCs w:val="false"/>
+                <w:color w:val="000000"/>
+                <w:sz w:val="18"/>
+                <w:szCs w:val="18"/>
+              </w:rPr>
+              <w:t xml:space="preserve">Consommables d’atelier</w:t>
             </w:r>
           </w:p>
           <w:p>
@@ -1433,195 +1464,7 @@
                 <w:sz w:val="16"/>
                 <w:szCs w:val="16"/>
               </w:rPr>
-              <w:t xml:space="preserve">Quantité pour trois transmetteurs.</w:t>
-            </w:r>
-          </w:p>
-        </w:tc>
-        <w:tc>
-          <w:tcPr>
-            <w:tcW w:type="dxa" w:w="700"/>
-            <w:tcMar>
-              <w:top w:type="dxa" w:w="60"/>
-              <w:left w:type="dxa" w:w="100"/>
-              <w:bottom w:type="dxa" w:w="60"/>
-              <w:right w:type="dxa" w:w="100"/>
-            </w:tcMar>
-            <w:vAlign w:val="center"/>
-          </w:tcPr>
-          <w:p>
-            <w:pPr>
-              <w:spacing w:after="0"/>
-              <w:jc w:val="center"/>
-            </w:pPr>
-            <w:r>
-              <w:rPr>
-                <w:rFonts w:ascii="Calibri" w:cs="Calibri" w:eastAsia="Calibri" w:hAnsi="Calibri"/>
-                <w:b w:val="false"/>
-                <w:bCs w:val="false"/>
-                <w:i w:val="false"/>
-                <w:iCs w:val="false"/>
-                <w:color w:val="000000"/>
-                <w:sz w:val="18"/>
-                <w:szCs w:val="18"/>
-              </w:rPr>
-              <w:t xml:space="preserve">3</w:t>
-            </w:r>
-          </w:p>
-        </w:tc>
-        <w:tc>
-          <w:tcPr>
-            <w:tcW w:type="dxa" w:w="1600"/>
-            <w:tcMar>
-              <w:top w:type="dxa" w:w="60"/>
-              <w:left w:type="dxa" w:w="100"/>
-              <w:bottom w:type="dxa" w:w="60"/>
-              <w:right w:type="dxa" w:w="100"/>
-            </w:tcMar>
-            <w:vAlign w:val="center"/>
-          </w:tcPr>
-          <w:p>
-            <w:pPr>
-              <w:spacing w:after="0"/>
-              <w:jc w:val="right"/>
-            </w:pPr>
-            <w:r>
-              <w:rPr>
-                <w:rFonts w:ascii="Calibri" w:cs="Calibri" w:eastAsia="Calibri" w:hAnsi="Calibri"/>
-                <w:b w:val="false"/>
-                <w:bCs w:val="false"/>
-                <w:i w:val="false"/>
-                <w:iCs w:val="false"/>
-                <w:color w:val="000000"/>
-                <w:sz w:val="18"/>
-                <w:szCs w:val="18"/>
-              </w:rPr>
-              <w:t xml:space="preserve">45 000</w:t>
-            </w:r>
-          </w:p>
-        </w:tc>
-        <w:tc>
-          <w:tcPr>
-            <w:tcW w:type="dxa" w:w="1800"/>
-            <w:tcMar>
-              <w:top w:type="dxa" w:w="60"/>
-              <w:left w:type="dxa" w:w="100"/>
-              <w:bottom w:type="dxa" w:w="60"/>
-              <w:right w:type="dxa" w:w="100"/>
-            </w:tcMar>
-            <w:vAlign w:val="center"/>
-          </w:tcPr>
-          <w:p>
-            <w:pPr>
-              <w:spacing w:after="0"/>
-              <w:jc w:val="right"/>
-            </w:pPr>
-            <w:r>
-              <w:rPr>
-                <w:rFonts w:ascii="Calibri" w:cs="Calibri" w:eastAsia="Calibri" w:hAnsi="Calibri"/>
-                <w:b/>
-                <w:bCs/>
-                <w:i w:val="false"/>
-                <w:iCs w:val="false"/>
-                <w:color w:val="000000"/>
-                <w:sz w:val="18"/>
-                <w:szCs w:val="18"/>
-              </w:rPr>
-              <w:t xml:space="preserve">135 000</w:t>
-            </w:r>
-          </w:p>
-        </w:tc>
-      </w:tr>
-      <w:tr>
-        <w:tc>
-          <w:tcPr>
-            <w:tcW w:type="dxa" w:w="9900"/>
-            <w:gridSpan w:val="5"/>
-            <w:shd w:fill="F2F2F2" w:color="auto" w:val="clear"/>
-            <w:tcMar>
-              <w:top w:type="dxa" w:w="60"/>
-              <w:left w:type="dxa" w:w="100"/>
-              <w:bottom w:type="dxa" w:w="60"/>
-              <w:right w:type="dxa" w:w="100"/>
-            </w:tcMar>
-          </w:tcPr>
-          <w:p>
-            <w:pPr>
-              <w:spacing w:after="0"/>
-            </w:pPr>
-            <w:r>
-              <w:rPr>
-                <w:rFonts w:ascii="Calibri" w:cs="Calibri" w:eastAsia="Calibri" w:hAnsi="Calibri"/>
-                <w:b/>
-                <w:bCs/>
-                <w:color w:val="1F3864"/>
-                <w:sz w:val="18"/>
-                <w:szCs w:val="18"/>
-              </w:rPr>
-              <w:t xml:space="preserve">B — CONSOMMABLES ET APPROVISIONNEMENT</w:t>
-            </w:r>
-          </w:p>
-        </w:tc>
-      </w:tr>
-      <w:tr>
-        <w:tc>
-          <w:tcPr>
-            <w:tcW w:type="dxa" w:w="600"/>
-            <w:tcMar>
-              <w:top w:type="dxa" w:w="60"/>
-              <w:left w:type="dxa" w:w="100"/>
-              <w:bottom w:type="dxa" w:w="60"/>
-              <w:right w:type="dxa" w:w="100"/>
-            </w:tcMar>
-            <w:vAlign w:val="center"/>
-          </w:tcPr>
-          <w:p>
-            <w:pPr>
-              <w:spacing w:after="0"/>
-              <w:jc w:val="center"/>
-            </w:pPr>
-            <w:r>
-              <w:rPr>
-                <w:rFonts w:ascii="Calibri" w:cs="Calibri" w:eastAsia="Calibri" w:hAnsi="Calibri"/>
-                <w:b w:val="false"/>
-                <w:bCs w:val="false"/>
-                <w:i w:val="false"/>
-                <w:iCs w:val="false"/>
-                <w:color w:val="000000"/>
-                <w:sz w:val="18"/>
-                <w:szCs w:val="18"/>
-              </w:rPr>
-              <w:t xml:space="preserve">6</w:t>
-            </w:r>
-          </w:p>
-        </w:tc>
-        <w:tc>
-          <w:tcPr>
-            <w:tcW w:type="dxa" w:w="5200"/>
-            <w:tcMar>
-              <w:top w:type="dxa" w:w="60"/>
-              <w:left w:type="dxa" w:w="100"/>
-              <w:bottom w:type="dxa" w:w="60"/>
-              <w:right w:type="dxa" w:w="100"/>
-            </w:tcMar>
-            <w:vAlign w:val="center"/>
-          </w:tcPr>
-          <w:p>
-            <w:pPr>
-              <w:spacing w:after="0"/>
-              <w:jc w:val="left"/>
-            </w:pPr>
-            <w:r>
-              <w:rPr>
-                <w:rFonts w:ascii="Calibri" w:cs="Calibri" w:eastAsia="Calibri" w:hAnsi="Calibri"/>
-                <w:b/>
-                <w:bCs/>
-                <w:i w:val="false"/>
-                <w:iCs w:val="false"/>
-                <w:color w:val="000000"/>
-                <w:sz w:val="18"/>
-                <w:szCs w:val="18"/>
-              </w:rPr>
-              <w:t xml:space="preserve">Consommables d’atelier</w:t>
+              <w:t xml:space="preserve">Soudure, tresse à dessouder, vernis de tropicalisation, produits de nettoyage</w:t>
             </w:r>
           </w:p>
           <w:p>
@@ -1640,25 +1483,6 @@
                 <w:sz w:val="16"/>
                 <w:szCs w:val="16"/>
               </w:rPr>
-              <w:t xml:space="preserve">Soudure, tresse à dessouder, vernis de tropicalisation, produits de nettoyage</w:t>
-            </w:r>
-          </w:p>
-          <w:p>
-            <w:pPr>
-              <w:spacing w:after="0"/>
-              <w:jc w:val="left"/>
-            </w:pPr>
-            <w:r>
-              <w:rPr>
-                <w:rFonts w:ascii="Calibri" w:cs="Calibri" w:eastAsia="Calibri" w:hAnsi="Calibri"/>
-                <w:b/>
-                <w:bCs/>
-                <w:i/>
-                <w:iCs/>
-                <w:color w:val="595959"/>
-                <w:sz w:val="16"/>
-                <w:szCs w:val="16"/>
-              </w:rPr>
               <w:t xml:space="preserve">de cartes, gaines thermorétractables et visserie.</w:t>
             </w:r>
           </w:p>
@@ -1785,7 +1609,7 @@
                 <w:sz w:val="18"/>
                 <w:szCs w:val="18"/>
               </w:rPr>
-              <w:t xml:space="preserve">7</w:t>
+              <w:t xml:space="preserve">6</w:t>
             </w:r>
           </w:p>
         </w:tc>
@@ -1973,7 +1797,7 @@
         <w:tc>
           <w:tcPr>
             <w:tcW w:type="dxa" w:w="1600"/>
-            <w:shd w:fill="FAFAFA" w:color="auto" w:val="clear"/>
+            <w:shd w:fill="1F3864" w:color="auto" w:val="clear"/>
             <w:tcMar>
               <w:top w:type="dxa" w:w="60"/>
               <w:left w:type="dxa" w:w="100"/>
@@ -1994,177 +1818,11 @@
                 <w:bCs/>
                 <w:i w:val="false"/>
                 <w:iCs w:val="false"/>
-                <w:color w:val="000000"/>
-                <w:sz w:val="18"/>
-                <w:szCs w:val="18"/>
-              </w:rPr>
-              <w:t xml:space="preserve">TOTAL HT</w:t>
-            </w:r>
-          </w:p>
-        </w:tc>
-        <w:tc>
-          <w:tcPr>
-            <w:tcW w:type="dxa" w:w="1800"/>
-            <w:shd w:fill="FAFAFA" w:color="auto" w:val="clear"/>
-            <w:tcMar>
-              <w:top w:type="dxa" w:w="60"/>
-              <w:left w:type="dxa" w:w="100"/>
-              <w:bottom w:type="dxa" w:w="60"/>
-              <w:right w:type="dxa" w:w="100"/>
-            </w:tcMar>
-            <w:vAlign w:val="center"/>
-          </w:tcPr>
-          <w:p>
-            <w:pPr>
-              <w:spacing w:after="0"/>
-              <w:jc w:val="right"/>
-            </w:pPr>
-            <w:r>
-              <w:rPr>
-                <w:rFonts w:ascii="Calibri" w:cs="Calibri" w:eastAsia="Calibri" w:hAnsi="Calibri"/>
-                <w:b/>
-                <w:bCs/>
-                <w:i w:val="false"/>
-                <w:iCs w:val="false"/>
-                <w:color w:val="000000"/>
-                <w:sz w:val="18"/>
-                <w:szCs w:val="18"/>
-              </w:rPr>
-              <w:t xml:space="preserve">705 000</w:t>
-            </w:r>
-          </w:p>
-        </w:tc>
-      </w:tr>
-      <w:tr>
-        <w:tc>
-          <w:tcPr>
-            <w:tcW w:type="dxa" w:w="6500"/>
-            <w:gridSpan w:val="3"/>
-            <w:tcBorders>
-              <w:top w:val="none" w:color="FFFFFF" w:sz="0"/>
-              <w:left w:val="none" w:color="FFFFFF" w:sz="0"/>
-              <w:bottom w:val="none" w:color="FFFFFF" w:sz="0"/>
-              <w:right w:val="none" w:color="FFFFFF" w:sz="0"/>
-            </w:tcBorders>
-          </w:tcPr>
-          <w:p>
-            <w:pPr>
-              <w:spacing w:after="0"/>
-            </w:pPr>
-          </w:p>
-        </w:tc>
-        <w:tc>
-          <w:tcPr>
-            <w:tcW w:type="dxa" w:w="1600"/>
-            <w:shd w:fill="FAFAFA" w:color="auto" w:val="clear"/>
-            <w:tcMar>
-              <w:top w:type="dxa" w:w="60"/>
-              <w:left w:type="dxa" w:w="100"/>
-              <w:bottom w:type="dxa" w:w="60"/>
-              <w:right w:type="dxa" w:w="100"/>
-            </w:tcMar>
-            <w:vAlign w:val="center"/>
-          </w:tcPr>
-          <w:p>
-            <w:pPr>
-              <w:spacing w:after="0"/>
-              <w:jc w:val="right"/>
-            </w:pPr>
-            <w:r>
-              <w:rPr>
-                <w:rFonts w:ascii="Calibri" w:cs="Calibri" w:eastAsia="Calibri" w:hAnsi="Calibri"/>
-                <w:b/>
-                <w:bCs/>
-                <w:i w:val="false"/>
-                <w:iCs w:val="false"/>
-                <w:color w:val="000000"/>
-                <w:sz w:val="18"/>
-                <w:szCs w:val="18"/>
-              </w:rPr>
-              <w:t xml:space="preserve">TVA 18 %</w:t>
-            </w:r>
-          </w:p>
-        </w:tc>
-        <w:tc>
-          <w:tcPr>
-            <w:tcW w:type="dxa" w:w="1800"/>
-            <w:shd w:fill="FAFAFA" w:color="auto" w:val="clear"/>
-            <w:tcMar>
-              <w:top w:type="dxa" w:w="60"/>
-              <w:left w:type="dxa" w:w="100"/>
-              <w:bottom w:type="dxa" w:w="60"/>
-              <w:right w:type="dxa" w:w="100"/>
-            </w:tcMar>
-            <w:vAlign w:val="center"/>
-          </w:tcPr>
-          <w:p>
-            <w:pPr>
-              <w:spacing w:after="0"/>
-              <w:jc w:val="right"/>
-            </w:pPr>
-            <w:r>
-              <w:rPr>
-                <w:rFonts w:ascii="Calibri" w:cs="Calibri" w:eastAsia="Calibri" w:hAnsi="Calibri"/>
-                <w:b/>
-                <w:bCs/>
-                <w:i w:val="false"/>
-                <w:iCs w:val="false"/>
-                <w:color w:val="000000"/>
-                <w:sz w:val="18"/>
-                <w:szCs w:val="18"/>
-              </w:rPr>
-              <w:t xml:space="preserve">126 900</w:t>
-            </w:r>
-          </w:p>
-        </w:tc>
-      </w:tr>
-      <w:tr>
-        <w:tc>
-          <w:tcPr>
-            <w:tcW w:type="dxa" w:w="6500"/>
-            <w:gridSpan w:val="3"/>
-            <w:tcBorders>
-              <w:top w:val="none" w:color="FFFFFF" w:sz="0"/>
-              <w:left w:val="none" w:color="FFFFFF" w:sz="0"/>
-              <w:bottom w:val="none" w:color="FFFFFF" w:sz="0"/>
-              <w:right w:val="none" w:color="FFFFFF" w:sz="0"/>
-            </w:tcBorders>
-          </w:tcPr>
-          <w:p>
-            <w:pPr>
-              <w:spacing w:after="0"/>
-            </w:pPr>
-          </w:p>
-        </w:tc>
-        <w:tc>
-          <w:tcPr>
-            <w:tcW w:type="dxa" w:w="1600"/>
-            <w:shd w:fill="1F3864" w:color="auto" w:val="clear"/>
-            <w:tcMar>
-              <w:top w:type="dxa" w:w="60"/>
-              <w:left w:type="dxa" w:w="100"/>
-              <w:bottom w:type="dxa" w:w="60"/>
-              <w:right w:type="dxa" w:w="100"/>
-            </w:tcMar>
-            <w:vAlign w:val="center"/>
-          </w:tcPr>
-          <w:p>
-            <w:pPr>
-              <w:spacing w:after="0"/>
-              <w:jc w:val="right"/>
-            </w:pPr>
-            <w:r>
-              <w:rPr>
-                <w:rFonts w:ascii="Calibri" w:cs="Calibri" w:eastAsia="Calibri" w:hAnsi="Calibri"/>
-                <w:b/>
-                <w:bCs/>
-                <w:i w:val="false"/>
-                <w:iCs w:val="false"/>
                 <w:color w:val="FFFFFF"/>
                 <w:sz w:val="18"/>
                 <w:szCs w:val="18"/>
               </w:rPr>
-              <w:t xml:space="preserve">TOTAL TTC (FCFA)</w:t>
+              <w:t xml:space="preserve">TOTAL À PAYER (FCFA)</w:t>
             </w:r>
           </w:p>
         </w:tc>
@@ -2196,7 +1854,7 @@
                 <w:sz w:val="22"/>
                 <w:szCs w:val="22"/>
               </w:rPr>
-              <w:t xml:space="preserve">831 900</w:t>
+              <w:t xml:space="preserve">610 000</w:t>
             </w:r>
           </w:p>
         </w:tc>
@@ -2223,7 +1881,7 @@
           <w:sz w:val="20"/>
           <w:szCs w:val="20"/>
         </w:rPr>
-        <w:t xml:space="preserve">Arrêté le présent devis proforma à la somme de : 831 900 FCFA TTC.</w:t>
+        <w:t xml:space="preserve">Arrêté le présent devis proforma à la somme de : 610 000 FCFA.</w:t>
       </w:r>
     </w:p>
     <w:tbl>
@@ -2306,7 +1964,7 @@
                 <w:sz w:val="18"/>
                 <w:szCs w:val="18"/>
               </w:rPr>
-              <w:t xml:space="preserve">Montant TTC</w:t>
+              <w:t xml:space="preserve">Montant</w:t>
             </w:r>
           </w:p>
         </w:tc>
@@ -2370,7 +2028,7 @@
                 <w:sz w:val="18"/>
                 <w:szCs w:val="18"/>
               </w:rPr>
-              <w:t xml:space="preserve">831 900</w:t>
+              <w:t xml:space="preserve">610 000</w:t>
             </w:r>
           </w:p>
         </w:tc>
@@ -2434,7 +2092,7 @@
                 <w:sz w:val="18"/>
                 <w:szCs w:val="18"/>
               </w:rPr>
-              <w:t xml:space="preserve">2 219 580</w:t>
+              <w:t xml:space="preserve">1 881 000</w:t>
             </w:r>
           </w:p>
         </w:tc>
@@ -2500,7 +2158,7 @@
                 <w:sz w:val="18"/>
                 <w:szCs w:val="18"/>
               </w:rPr>
-              <w:t xml:space="preserve">3 051 480</w:t>
+              <w:t xml:space="preserve">2 491 000</w:t>
             </w:r>
           </w:p>
         </w:tc>
@@ -2629,7 +2287,7 @@
                 <w:sz w:val="18"/>
                 <w:szCs w:val="18"/>
               </w:rPr>
-              <w:t xml:space="preserve">Prix HT (FCFA)</w:t>
+              <w:t xml:space="preserve">Prix (FCFA)</w:t>
             </w:r>
           </w:p>
         </w:tc>
@@ -3016,7 +2674,7 @@
           <w:sz w:val="18"/>
           <w:szCs w:val="18"/>
         </w:rPr>
-        <w:t xml:space="preserve">Montants exprimés en francs CFA (XOF), hors taxes, TVA 18 % en sus.</w:t>
+        <w:t xml:space="preserve">Montants exprimés en francs CFA (XOF). TVA non applicable — [préciser le régime : exonération, franchise ou assujettissement du client].</w:t>
       </w:r>
     </w:p>
     <w:p>

</xml_diff>